<commit_message>
Name both members and give each a signature line
William Faitel and Casey Faitel are both Liquidators, so the letterhead names
both and the signature block now has a LIQUIDATOR section where each signs and
dates on their own line, above a labelled SELLER section.

Previously the block only identified the LLC by name with no place for the
Liquidator to execute at all — only the Seller signed.

Co-Authored-By: Claude Opus 5 <noreply@anthropic.com>
Claude-Session: https://claude.ai/code/session_01D5T4gyGDQjN36VTctZfALA
</commit_message>
<xml_diff>
--- a/contracts/High_Caliber_Estate_Sales_Agreement.docx
+++ b/contracts/High_Caliber_Estate_Sales_Agreement.docx
@@ -73,7 +73,7 @@
           <w:sz w:val="19"/>
           <w:szCs w:val="19"/>
         </w:rPr>
-        <w:t xml:space="preserve">Owner: [OWNER NAME]</w:t>
+        <w:t xml:space="preserve">William Faitel  •  Casey Faitel, Members</w:t>
       </w:r>
     </w:p>
     <w:p>
@@ -2681,7 +2681,7 @@
     </w:p>
     <w:p>
       <w:pPr>
-        <w:spacing w:after="200" w:line="246"/>
+        <w:spacing w:after="140" w:line="246"/>
       </w:pPr>
       <w:r>
         <w:rPr>
@@ -2691,7 +2691,326 @@
           <w:sz w:val="22"/>
           <w:szCs w:val="22"/>
         </w:rPr>
-        <w:t xml:space="preserve">Liquidator:  High Caliber Estate Sales LLC</w:t>
+        <w:t xml:space="preserve">LIQUIDATOR:  High Caliber Estate Sales LLC</w:t>
+      </w:r>
+    </w:p>
+    <w:tbl>
+      <w:tblPr>
+        <w:tblW w:type="dxa" w:w="10540"/>
+        <w:tblBorders>
+          <w:top w:val="none" w:color="FFFFFF" w:sz="0"/>
+          <w:left w:val="none" w:color="FFFFFF" w:sz="0"/>
+          <w:bottom w:val="none" w:color="FFFFFF" w:sz="0"/>
+          <w:right w:val="none" w:color="FFFFFF" w:sz="0"/>
+          <w:insideH w:val="none" w:color="FFFFFF" w:sz="0"/>
+          <w:insideV w:val="none" w:color="FFFFFF" w:sz="0"/>
+        </w:tblBorders>
+      </w:tblPr>
+      <w:tblGrid>
+        <w:gridCol w:w="2900"/>
+        <w:gridCol w:w="2370"/>
+        <w:gridCol w:w="800"/>
+        <w:gridCol w:w="4470"/>
+      </w:tblGrid>
+      <w:tr>
+        <w:trPr>
+          <w:trHeight w:val="440" w:hRule="atLeast"/>
+        </w:trPr>
+        <w:tc>
+          <w:tcPr>
+            <w:tcW w:type="dxa" w:w="2900"/>
+            <w:tcBorders>
+              <w:top w:val="none" w:color="FFFFFF" w:sz="0"/>
+              <w:left w:val="none" w:color="FFFFFF" w:sz="0"/>
+              <w:bottom w:val="none" w:color="FFFFFF" w:sz="0"/>
+              <w:right w:val="none" w:color="FFFFFF" w:sz="0"/>
+            </w:tcBorders>
+            <w:tcMar>
+              <w:top w:type="dxa" w:w="20"/>
+              <w:left w:type="dxa" w:w="0"/>
+              <w:bottom w:type="dxa" w:w="20"/>
+              <w:right w:type="dxa" w:w="100"/>
+            </w:tcMar>
+            <w:vAlign w:val="bottom"/>
+          </w:tcPr>
+          <w:p>
+            <w:pPr>
+              <w:spacing w:after="0" w:line="240"/>
+            </w:pPr>
+            <w:r>
+              <w:rPr>
+                <w:rFonts w:ascii="Calibri" w:cs="Calibri" w:eastAsia="Calibri" w:hAnsi="Calibri"/>
+                <w:b/>
+                <w:bCs/>
+                <w:sz w:val="21"/>
+                <w:szCs w:val="21"/>
+              </w:rPr>
+              <w:t xml:space="preserve">By: William Faitel, Member</w:t>
+            </w:r>
+          </w:p>
+        </w:tc>
+        <w:tc>
+          <w:tcPr>
+            <w:tcW w:type="dxa" w:w="2370"/>
+            <w:tcBorders>
+              <w:top w:val="none" w:color="FFFFFF" w:sz="0"/>
+              <w:left w:val="none" w:color="FFFFFF" w:sz="0"/>
+              <w:bottom w:val="single" w:color="000000" w:sz="6"/>
+              <w:right w:val="none" w:color="FFFFFF" w:sz="0"/>
+            </w:tcBorders>
+            <w:tcMar>
+              <w:top w:type="dxa" w:w="20"/>
+              <w:left w:type="dxa" w:w="0"/>
+              <w:bottom w:type="dxa" w:w="20"/>
+              <w:right w:type="dxa" w:w="100"/>
+            </w:tcMar>
+            <w:vAlign w:val="bottom"/>
+          </w:tcPr>
+          <w:p>
+            <w:pPr>
+              <w:spacing w:after="0" w:line="240"/>
+            </w:pPr>
+            <w:r>
+              <w:rPr>
+                <w:rFonts w:ascii="Calibri" w:cs="Calibri" w:eastAsia="Calibri" w:hAnsi="Calibri"/>
+                <w:sz w:val="21"/>
+                <w:szCs w:val="21"/>
+              </w:rPr>
+              <w:t xml:space="preserve"/>
+            </w:r>
+          </w:p>
+        </w:tc>
+        <w:tc>
+          <w:tcPr>
+            <w:tcW w:type="dxa" w:w="800"/>
+            <w:tcBorders>
+              <w:top w:val="none" w:color="FFFFFF" w:sz="0"/>
+              <w:left w:val="none" w:color="FFFFFF" w:sz="0"/>
+              <w:bottom w:val="none" w:color="FFFFFF" w:sz="0"/>
+              <w:right w:val="none" w:color="FFFFFF" w:sz="0"/>
+            </w:tcBorders>
+            <w:tcMar>
+              <w:top w:type="dxa" w:w="20"/>
+              <w:left w:type="dxa" w:w="0"/>
+              <w:bottom w:type="dxa" w:w="20"/>
+              <w:right w:type="dxa" w:w="100"/>
+            </w:tcMar>
+            <w:vAlign w:val="bottom"/>
+          </w:tcPr>
+          <w:p>
+            <w:pPr>
+              <w:spacing w:after="0" w:line="240"/>
+            </w:pPr>
+            <w:r>
+              <w:rPr>
+                <w:rFonts w:ascii="Calibri" w:cs="Calibri" w:eastAsia="Calibri" w:hAnsi="Calibri"/>
+                <w:b/>
+                <w:bCs/>
+                <w:sz w:val="21"/>
+                <w:szCs w:val="21"/>
+              </w:rPr>
+              <w:t xml:space="preserve">Date:</w:t>
+            </w:r>
+          </w:p>
+        </w:tc>
+        <w:tc>
+          <w:tcPr>
+            <w:tcW w:type="dxa" w:w="4470"/>
+            <w:tcBorders>
+              <w:top w:val="none" w:color="FFFFFF" w:sz="0"/>
+              <w:left w:val="none" w:color="FFFFFF" w:sz="0"/>
+              <w:bottom w:val="single" w:color="000000" w:sz="6"/>
+              <w:right w:val="none" w:color="FFFFFF" w:sz="0"/>
+            </w:tcBorders>
+            <w:tcMar>
+              <w:top w:type="dxa" w:w="20"/>
+              <w:left w:type="dxa" w:w="0"/>
+              <w:bottom w:type="dxa" w:w="20"/>
+              <w:right w:type="dxa" w:w="100"/>
+            </w:tcMar>
+            <w:vAlign w:val="bottom"/>
+          </w:tcPr>
+          <w:p>
+            <w:pPr>
+              <w:spacing w:after="0" w:line="240"/>
+            </w:pPr>
+            <w:r>
+              <w:rPr>
+                <w:rFonts w:ascii="Calibri" w:cs="Calibri" w:eastAsia="Calibri" w:hAnsi="Calibri"/>
+                <w:sz w:val="21"/>
+                <w:szCs w:val="21"/>
+              </w:rPr>
+              <w:t xml:space="preserve"/>
+            </w:r>
+          </w:p>
+        </w:tc>
+      </w:tr>
+    </w:tbl>
+    <w:tbl>
+      <w:tblPr>
+        <w:tblW w:type="dxa" w:w="10540"/>
+        <w:tblBorders>
+          <w:top w:val="none" w:color="FFFFFF" w:sz="0"/>
+          <w:left w:val="none" w:color="FFFFFF" w:sz="0"/>
+          <w:bottom w:val="none" w:color="FFFFFF" w:sz="0"/>
+          <w:right w:val="none" w:color="FFFFFF" w:sz="0"/>
+          <w:insideH w:val="none" w:color="FFFFFF" w:sz="0"/>
+          <w:insideV w:val="none" w:color="FFFFFF" w:sz="0"/>
+        </w:tblBorders>
+      </w:tblPr>
+      <w:tblGrid>
+        <w:gridCol w:w="2900"/>
+        <w:gridCol w:w="2370"/>
+        <w:gridCol w:w="800"/>
+        <w:gridCol w:w="4470"/>
+      </w:tblGrid>
+      <w:tr>
+        <w:trPr>
+          <w:trHeight w:val="440" w:hRule="atLeast"/>
+        </w:trPr>
+        <w:tc>
+          <w:tcPr>
+            <w:tcW w:type="dxa" w:w="2900"/>
+            <w:tcBorders>
+              <w:top w:val="none" w:color="FFFFFF" w:sz="0"/>
+              <w:left w:val="none" w:color="FFFFFF" w:sz="0"/>
+              <w:bottom w:val="none" w:color="FFFFFF" w:sz="0"/>
+              <w:right w:val="none" w:color="FFFFFF" w:sz="0"/>
+            </w:tcBorders>
+            <w:tcMar>
+              <w:top w:type="dxa" w:w="20"/>
+              <w:left w:type="dxa" w:w="0"/>
+              <w:bottom w:type="dxa" w:w="20"/>
+              <w:right w:type="dxa" w:w="100"/>
+            </w:tcMar>
+            <w:vAlign w:val="bottom"/>
+          </w:tcPr>
+          <w:p>
+            <w:pPr>
+              <w:spacing w:after="0" w:line="240"/>
+            </w:pPr>
+            <w:r>
+              <w:rPr>
+                <w:rFonts w:ascii="Calibri" w:cs="Calibri" w:eastAsia="Calibri" w:hAnsi="Calibri"/>
+                <w:b/>
+                <w:bCs/>
+                <w:sz w:val="21"/>
+                <w:szCs w:val="21"/>
+              </w:rPr>
+              <w:t xml:space="preserve">By: Casey Faitel, Member</w:t>
+            </w:r>
+          </w:p>
+        </w:tc>
+        <w:tc>
+          <w:tcPr>
+            <w:tcW w:type="dxa" w:w="2370"/>
+            <w:tcBorders>
+              <w:top w:val="none" w:color="FFFFFF" w:sz="0"/>
+              <w:left w:val="none" w:color="FFFFFF" w:sz="0"/>
+              <w:bottom w:val="single" w:color="000000" w:sz="6"/>
+              <w:right w:val="none" w:color="FFFFFF" w:sz="0"/>
+            </w:tcBorders>
+            <w:tcMar>
+              <w:top w:type="dxa" w:w="20"/>
+              <w:left w:type="dxa" w:w="0"/>
+              <w:bottom w:type="dxa" w:w="20"/>
+              <w:right w:type="dxa" w:w="100"/>
+            </w:tcMar>
+            <w:vAlign w:val="bottom"/>
+          </w:tcPr>
+          <w:p>
+            <w:pPr>
+              <w:spacing w:after="0" w:line="240"/>
+            </w:pPr>
+            <w:r>
+              <w:rPr>
+                <w:rFonts w:ascii="Calibri" w:cs="Calibri" w:eastAsia="Calibri" w:hAnsi="Calibri"/>
+                <w:sz w:val="21"/>
+                <w:szCs w:val="21"/>
+              </w:rPr>
+              <w:t xml:space="preserve"/>
+            </w:r>
+          </w:p>
+        </w:tc>
+        <w:tc>
+          <w:tcPr>
+            <w:tcW w:type="dxa" w:w="800"/>
+            <w:tcBorders>
+              <w:top w:val="none" w:color="FFFFFF" w:sz="0"/>
+              <w:left w:val="none" w:color="FFFFFF" w:sz="0"/>
+              <w:bottom w:val="none" w:color="FFFFFF" w:sz="0"/>
+              <w:right w:val="none" w:color="FFFFFF" w:sz="0"/>
+            </w:tcBorders>
+            <w:tcMar>
+              <w:top w:type="dxa" w:w="20"/>
+              <w:left w:type="dxa" w:w="0"/>
+              <w:bottom w:type="dxa" w:w="20"/>
+              <w:right w:type="dxa" w:w="100"/>
+            </w:tcMar>
+            <w:vAlign w:val="bottom"/>
+          </w:tcPr>
+          <w:p>
+            <w:pPr>
+              <w:spacing w:after="0" w:line="240"/>
+            </w:pPr>
+            <w:r>
+              <w:rPr>
+                <w:rFonts w:ascii="Calibri" w:cs="Calibri" w:eastAsia="Calibri" w:hAnsi="Calibri"/>
+                <w:b/>
+                <w:bCs/>
+                <w:sz w:val="21"/>
+                <w:szCs w:val="21"/>
+              </w:rPr>
+              <w:t xml:space="preserve">Date:</w:t>
+            </w:r>
+          </w:p>
+        </w:tc>
+        <w:tc>
+          <w:tcPr>
+            <w:tcW w:type="dxa" w:w="4470"/>
+            <w:tcBorders>
+              <w:top w:val="none" w:color="FFFFFF" w:sz="0"/>
+              <w:left w:val="none" w:color="FFFFFF" w:sz="0"/>
+              <w:bottom w:val="single" w:color="000000" w:sz="6"/>
+              <w:right w:val="none" w:color="FFFFFF" w:sz="0"/>
+            </w:tcBorders>
+            <w:tcMar>
+              <w:top w:type="dxa" w:w="20"/>
+              <w:left w:type="dxa" w:w="0"/>
+              <w:bottom w:type="dxa" w:w="20"/>
+              <w:right w:type="dxa" w:w="100"/>
+            </w:tcMar>
+            <w:vAlign w:val="bottom"/>
+          </w:tcPr>
+          <w:p>
+            <w:pPr>
+              <w:spacing w:after="0" w:line="240"/>
+            </w:pPr>
+            <w:r>
+              <w:rPr>
+                <w:rFonts w:ascii="Calibri" w:cs="Calibri" w:eastAsia="Calibri" w:hAnsi="Calibri"/>
+                <w:sz w:val="21"/>
+                <w:szCs w:val="21"/>
+              </w:rPr>
+              <w:t xml:space="preserve"/>
+            </w:r>
+          </w:p>
+        </w:tc>
+      </w:tr>
+    </w:tbl>
+    <w:p>
+      <w:pPr>
+        <w:spacing w:after="140" w:before="260" w:line="246"/>
+      </w:pPr>
+      <w:r>
+        <w:rPr>
+          <w:rFonts w:ascii="Calibri" w:cs="Calibri" w:eastAsia="Calibri" w:hAnsi="Calibri"/>
+          <w:b/>
+          <w:bCs/>
+          <w:sz w:val="22"/>
+          <w:szCs w:val="22"/>
+        </w:rPr>
+        <w:t xml:space="preserve">SELLER:</w:t>
       </w:r>
     </w:p>
     <w:tbl>

</xml_diff>

<commit_message>
Fill in business address and phone
Street corrected to Wellston Dr — the earlier draft had Wilson Drive. Full
address is now 32055 Wellston Dr, Warren, MI 48093, with phone (586) 246-8620.

Email remains the only outstanding letterhead placeholder.

Co-Authored-By: Claude Opus 5 <noreply@anthropic.com>
Claude-Session: https://claude.ai/code/session_01D5T4gyGDQjN36VTctZfALA
</commit_message>
<xml_diff>
--- a/contracts/High_Caliber_Estate_Sales_Agreement.docx
+++ b/contracts/High_Caliber_Estate_Sales_Agreement.docx
@@ -45,7 +45,7 @@
           <w:sz w:val="19"/>
           <w:szCs w:val="19"/>
         </w:rPr>
-        <w:t xml:space="preserve">32055 Wilson Drive, Warren, MI  [ZIP]</w:t>
+        <w:t xml:space="preserve">32055 Wellston Dr, Warren, MI 48093</w:t>
       </w:r>
     </w:p>
     <w:p>
@@ -59,7 +59,7 @@
           <w:sz w:val="19"/>
           <w:szCs w:val="19"/>
         </w:rPr>
-        <w:t xml:space="preserve">Phone: [PHONE]   •   Email: [EMAIL]   •   highcaliberestatesales.com</w:t>
+        <w:t xml:space="preserve">Phone: (586) 246-8620   •   Email: [EMAIL]   •   highcaliberestatesales.com</w:t>
       </w:r>
     </w:p>
     <w:p>

</xml_diff>

<commit_message>
Add business email; letterhead placeholders all resolved
Phone, email, and site on one line would have run past the measure at this
size, so contact details now sit on two lines: phone and email, then the site.

Co-Authored-By: Claude Opus 5 <noreply@anthropic.com>
Claude-Session: https://claude.ai/code/session_01D5T4gyGDQjN36VTctZfALA
</commit_message>
<xml_diff>
--- a/contracts/High_Caliber_Estate_Sales_Agreement.docx
+++ b/contracts/High_Caliber_Estate_Sales_Agreement.docx
@@ -59,7 +59,21 @@
           <w:sz w:val="19"/>
           <w:szCs w:val="19"/>
         </w:rPr>
-        <w:t xml:space="preserve">Phone: (586) 246-8620   •   Email: [EMAIL]   •   highcaliberestatesales.com</w:t>
+        <w:t xml:space="preserve">Phone: (586) 246-8620   •   contact@highcaliberestatesales.com</w:t>
+      </w:r>
+    </w:p>
+    <w:p>
+      <w:pPr>
+        <w:spacing w:after="30" w:line="240"/>
+        <w:jc w:val="center"/>
+      </w:pPr>
+      <w:r>
+        <w:rPr>
+          <w:rFonts w:ascii="Calibri" w:cs="Calibri" w:eastAsia="Calibri" w:hAnsi="Calibri"/>
+          <w:sz w:val="19"/>
+          <w:szCs w:val="19"/>
+        </w:rPr>
+        <w:t xml:space="preserve">highcaliberestatesales.com</w:t>
       </w:r>
     </w:p>
     <w:p>

</xml_diff>

<commit_message>
Restore the footer on page 1
titlePage: true splits the footer as well as the header. Only a first-page
header was defined, so page 1 fell back to no footer at all — losing its page
number and Seller Initials line while pages 2-4 kept theirs.

The footer is now a pageFooter() factory used for both the first and default
slots, so all four pages carry it.

Co-Authored-By: Claude Opus 5 <noreply@anthropic.com>
Claude-Session: https://claude.ai/code/session_01D5T4gyGDQjN36VTctZfALA
</commit_message>
<xml_diff>
--- a/contracts/High_Caliber_Estate_Sales_Agreement.docx
+++ b/contracts/High_Caliber_Estate_Sales_Agreement.docx
@@ -3963,6 +3963,7 @@
       <w:headerReference w:type="default" r:id="rId7"/>
       <w:headerReference w:type="first" r:id="rId8"/>
       <w:footerReference w:type="default" r:id="rId9"/>
+      <w:footerReference w:type="first" r:id="rId10"/>
       <w:pgSz w:w="12240" w:h="15840" w:orient="portrait"/>
       <w:pgMar w:top="950" w:right="850" w:bottom="620" w:left="850" w:header="340" w:footer="270" w:gutter="0"/>
       <w:pgNumType/>
@@ -4015,6 +4016,71 @@
 </file>
 
 <file path=word/footer1.xml><?xml version="1.0" encoding="utf-8"?>
+<w:ftr xmlns:wpc="http://schemas.microsoft.com/office/word/2010/wordprocessingCanvas" xmlns:mc="http://schemas.openxmlformats.org/markup-compatibility/2006" xmlns:o="urn:schemas-microsoft-com:office:office" xmlns:r="http://schemas.openxmlformats.org/officeDocument/2006/relationships" xmlns:m="http://schemas.openxmlformats.org/officeDocument/2006/math" xmlns:v="urn:schemas-microsoft-com:vml" xmlns:wp14="http://schemas.microsoft.com/office/word/2010/wordprocessingDrawing" xmlns:wp="http://schemas.openxmlformats.org/drawingml/2006/wordprocessingDrawing" xmlns:w10="urn:schemas-microsoft-com:office:word" xmlns:w="http://schemas.openxmlformats.org/wordprocessingml/2006/main" xmlns:w14="http://schemas.microsoft.com/office/word/2010/wordml" xmlns:w15="http://schemas.microsoft.com/office/word/2012/wordml" xmlns:wpg="http://schemas.microsoft.com/office/word/2010/wordprocessingGroup" xmlns:wpi="http://schemas.microsoft.com/office/word/2010/wordprocessingInk" xmlns:wne="http://schemas.microsoft.com/office/word/2006/wordml" xmlns:wps="http://schemas.microsoft.com/office/word/2010/wordprocessingShape">
+  <w:p>
+    <w:pPr>
+      <w:spacing w:before="100"/>
+      <w:jc w:val="center"/>
+    </w:pPr>
+    <w:r>
+      <w:rPr>
+        <w:rFonts w:ascii="Calibri" w:cs="Calibri" w:eastAsia="Calibri" w:hAnsi="Calibri"/>
+        <w:sz w:val="15"/>
+        <w:szCs w:val="15"/>
+      </w:rPr>
+      <w:t xml:space="preserve">High Caliber Estate Sales LLC — Agreement to Conduct Estate Sale     Seller Initials: </w:t>
+    </w:r>
+    <w:r>
+      <w:rPr>
+        <w:rFonts w:ascii="Calibri" w:cs="Calibri" w:eastAsia="Calibri" w:hAnsi="Calibri"/>
+        <w:sz w:val="15"/>
+        <w:szCs w:val="15"/>
+      </w:rPr>
+      <w:t xml:space="preserve">_________</w:t>
+    </w:r>
+    <w:r>
+      <w:rPr>
+        <w:rFonts w:ascii="Calibri" w:cs="Calibri" w:eastAsia="Calibri" w:hAnsi="Calibri"/>
+        <w:sz w:val="15"/>
+        <w:szCs w:val="15"/>
+      </w:rPr>
+      <w:t xml:space="preserve">     Page </w:t>
+    </w:r>
+    <w:r>
+      <w:rPr>
+        <w:rFonts w:ascii="Calibri" w:cs="Calibri" w:eastAsia="Calibri" w:hAnsi="Calibri"/>
+        <w:sz w:val="15"/>
+        <w:szCs w:val="15"/>
+      </w:rPr>
+      <w:fldChar w:fldCharType="begin"/>
+      <w:instrText xml:space="preserve">PAGE</w:instrText>
+      <w:fldChar w:fldCharType="separate"/>
+      <w:fldChar w:fldCharType="end"/>
+    </w:r>
+    <w:r>
+      <w:rPr>
+        <w:rFonts w:ascii="Calibri" w:cs="Calibri" w:eastAsia="Calibri" w:hAnsi="Calibri"/>
+        <w:sz w:val="15"/>
+        <w:szCs w:val="15"/>
+      </w:rPr>
+      <w:t xml:space="preserve"> of </w:t>
+    </w:r>
+    <w:r>
+      <w:rPr>
+        <w:rFonts w:ascii="Calibri" w:cs="Calibri" w:eastAsia="Calibri" w:hAnsi="Calibri"/>
+        <w:sz w:val="15"/>
+        <w:szCs w:val="15"/>
+      </w:rPr>
+      <w:fldChar w:fldCharType="begin"/>
+      <w:instrText xml:space="preserve">NUMPAGES</w:instrText>
+      <w:fldChar w:fldCharType="separate"/>
+      <w:fldChar w:fldCharType="end"/>
+    </w:r>
+  </w:p>
+</w:ftr>
+</file>
+
+<file path=word/footer2.xml><?xml version="1.0" encoding="utf-8"?>
 <w:ftr xmlns:wpc="http://schemas.microsoft.com/office/word/2010/wordprocessingCanvas" xmlns:mc="http://schemas.openxmlformats.org/markup-compatibility/2006" xmlns:o="urn:schemas-microsoft-com:office:office" xmlns:r="http://schemas.openxmlformats.org/officeDocument/2006/relationships" xmlns:m="http://schemas.openxmlformats.org/officeDocument/2006/math" xmlns:v="urn:schemas-microsoft-com:vml" xmlns:wp14="http://schemas.microsoft.com/office/word/2010/wordprocessingDrawing" xmlns:wp="http://schemas.openxmlformats.org/drawingml/2006/wordprocessingDrawing" xmlns:w10="urn:schemas-microsoft-com:office:word" xmlns:w="http://schemas.openxmlformats.org/wordprocessingml/2006/main" xmlns:w14="http://schemas.microsoft.com/office/word/2010/wordml" xmlns:w15="http://schemas.microsoft.com/office/word/2012/wordml" xmlns:wpg="http://schemas.microsoft.com/office/word/2010/wordprocessingGroup" xmlns:wpi="http://schemas.microsoft.com/office/word/2010/wordprocessingInk" xmlns:wne="http://schemas.microsoft.com/office/word/2006/wordml" xmlns:wps="http://schemas.microsoft.com/office/word/2010/wordprocessingShape">
   <w:p>
     <w:pPr>

</xml_diff>